<commit_message>
Wire mined art into Session 3, Session 4, and compendium builds
Floraburst plate at the companion choice (S3 + bestiary), the
Krampusshade reveal plate (S4 + bestiary), Amulet of Guiding Light in
treasures. All five documents rebuilt and render-verified.

Co-Authored-By: Claude Opus 4.8 <noreply@anthropic.com>
</commit_message>
<xml_diff>
--- a/compendium/treasures_and_relics.docx
+++ b/compendium/treasures_and_relics.docx
@@ -955,6 +955,62 @@
     <w:p>
       <w:pPr>
         <w:keepNext/>
+        <w:spacing w:before="160"/>
+        <w:jc w:val="center"/>
+      </w:pPr>
+      <w:r>
+        <w:drawing>
+          <wp:inline xmlns:a="http://schemas.openxmlformats.org/drawingml/2006/main" xmlns:pic="http://schemas.openxmlformats.org/drawingml/2006/picture">
+            <wp:extent cx="2743200" cy="2743200"/>
+            <wp:docPr id="1" name="Picture 1"/>
+            <wp:cNvGraphicFramePr>
+              <a:graphicFrameLocks noChangeAspect="1"/>
+            </wp:cNvGraphicFramePr>
+            <a:graphic>
+              <a:graphicData uri="http://schemas.openxmlformats.org/drawingml/2006/picture">
+                <pic:pic>
+                  <pic:nvPicPr>
+                    <pic:cNvPr id="0" name="image.png"/>
+                    <pic:cNvPicPr/>
+                  </pic:nvPicPr>
+                  <pic:blipFill>
+                    <a:blip r:embed="rId10"/>
+                    <a:stretch>
+                      <a:fillRect/>
+                    </a:stretch>
+                  </pic:blipFill>
+                  <pic:spPr>
+                    <a:xfrm>
+                      <a:off x="0" y="0"/>
+                      <a:ext cx="2743200" cy="2743200"/>
+                    </a:xfrm>
+                    <a:prstGeom prst="rect"/>
+                  </pic:spPr>
+                </pic:pic>
+              </a:graphicData>
+            </a:graphic>
+          </wp:inline>
+        </w:drawing>
+      </w:r>
+    </w:p>
+    <w:p>
+      <w:pPr>
+        <w:spacing w:after="180"/>
+        <w:jc w:val="center"/>
+      </w:pPr>
+      <w:r>
+        <w:rPr>
+          <w:rFonts w:ascii="Georgia" w:hAnsi="Georgia" w:cs="Georgia"/>
+          <w:i/>
+          <w:color w:val="888888"/>
+          <w:sz w:val="18"/>
+        </w:rPr>
+        <w:t>The Amulet of Guiding Light.</w:t>
+      </w:r>
+    </w:p>
+    <w:p>
+      <w:pPr>
+        <w:keepNext/>
         <w:spacing w:before="280" w:after="80"/>
       </w:pPr>
       <w:r>

</xml_diff>

<commit_message>
Layout engine: flow content continuously, cap portrait image height
Root fix for excessive whitespace: remove the per-part page breaks
(inherited from the S8 gold standard) so sections flow and pack; only
the Appendix hard-breaks. Tighten heading/body/image spacing and cap
rendered image height at 4.2in so tall art stops stranding half-empty
pages. Session 1 alone drops 12 to 10 pages; all docs rebuilt.

Co-Authored-By: Claude Opus 4.8 <noreply@anthropic.com>
</commit_message>
<xml_diff>
--- a/compendium/treasures_and_relics.docx
+++ b/compendium/treasures_and_relics.docx
@@ -4,7 +4,7 @@
   <w:body>
     <w:p>
       <w:pPr>
-        <w:spacing w:before="1200"/>
+        <w:spacing w:before="480"/>
         <w:jc w:val="center"/>
       </w:pPr>
       <w:r>
@@ -97,8 +97,7 @@
     <w:p>
       <w:pPr>
         <w:keepNext/>
-        <w:pageBreakBefore/>
-        <w:spacing w:before="360" w:after="120"/>
+        <w:spacing w:before="400" w:after="120"/>
       </w:pPr>
       <w:r>
         <w:rPr>
@@ -113,7 +112,7 @@
     <w:p>
       <w:pPr>
         <w:keepNext/>
-        <w:spacing w:before="280" w:after="80"/>
+        <w:spacing w:before="220" w:after="60"/>
       </w:pPr>
       <w:r>
         <w:rPr>
@@ -127,7 +126,7 @@
     </w:p>
     <w:p>
       <w:pPr>
-        <w:spacing w:after="120"/>
+        <w:spacing w:after="80"/>
       </w:pPr>
       <w:r>
         <w:rPr>
@@ -163,7 +162,7 @@
     <w:p>
       <w:pPr>
         <w:keepNext/>
-        <w:spacing w:before="280" w:after="80"/>
+        <w:spacing w:before="220" w:after="60"/>
       </w:pPr>
       <w:r>
         <w:rPr>
@@ -177,7 +176,7 @@
     </w:p>
     <w:p>
       <w:pPr>
-        <w:spacing w:after="120"/>
+        <w:spacing w:after="80"/>
       </w:pPr>
       <w:r>
         <w:rPr>
@@ -213,7 +212,7 @@
     <w:p>
       <w:pPr>
         <w:keepNext/>
-        <w:spacing w:before="280" w:after="80"/>
+        <w:spacing w:before="220" w:after="60"/>
       </w:pPr>
       <w:r>
         <w:rPr>
@@ -227,7 +226,7 @@
     </w:p>
     <w:p>
       <w:pPr>
-        <w:spacing w:after="120"/>
+        <w:spacing w:after="80"/>
       </w:pPr>
       <w:r>
         <w:rPr>
@@ -243,8 +242,7 @@
     <w:p>
       <w:pPr>
         <w:keepNext/>
-        <w:pageBreakBefore/>
-        <w:spacing w:before="360" w:after="120"/>
+        <w:spacing w:before="400" w:after="120"/>
       </w:pPr>
       <w:r>
         <w:rPr>
@@ -258,7 +256,7 @@
     </w:p>
     <w:p>
       <w:pPr>
-        <w:spacing w:after="120"/>
+        <w:spacing w:after="80"/>
       </w:pPr>
       <w:r>
         <w:rPr>
@@ -274,7 +272,7 @@
     <w:p>
       <w:pPr>
         <w:keepNext/>
-        <w:spacing w:before="280" w:after="80"/>
+        <w:spacing w:before="220" w:after="60"/>
       </w:pPr>
       <w:r>
         <w:rPr>
@@ -409,7 +407,7 @@
     <w:p>
       <w:pPr>
         <w:keepNext/>
-        <w:spacing w:before="280" w:after="80"/>
+        <w:spacing w:before="220" w:after="60"/>
       </w:pPr>
       <w:r>
         <w:rPr>
@@ -544,7 +542,7 @@
     <w:p>
       <w:pPr>
         <w:keepNext/>
-        <w:spacing w:before="280" w:after="80"/>
+        <w:spacing w:before="220" w:after="60"/>
       </w:pPr>
       <w:r>
         <w:rPr>
@@ -719,8 +717,7 @@
     <w:p>
       <w:pPr>
         <w:keepNext/>
-        <w:pageBreakBefore/>
-        <w:spacing w:before="360" w:after="120"/>
+        <w:spacing w:before="400" w:after="120"/>
       </w:pPr>
       <w:r>
         <w:rPr>
@@ -735,7 +732,7 @@
     <w:p>
       <w:pPr>
         <w:keepNext/>
-        <w:spacing w:before="280" w:after="80"/>
+        <w:spacing w:before="220" w:after="60"/>
       </w:pPr>
       <w:r>
         <w:rPr>
@@ -820,7 +817,7 @@
     <w:p>
       <w:pPr>
         <w:keepNext/>
-        <w:spacing w:before="280" w:after="80"/>
+        <w:spacing w:before="220" w:after="60"/>
       </w:pPr>
       <w:r>
         <w:rPr>
@@ -955,7 +952,7 @@
     <w:p>
       <w:pPr>
         <w:keepNext/>
-        <w:spacing w:before="160"/>
+        <w:spacing w:before="120" w:after="40"/>
         <w:jc w:val="center"/>
       </w:pPr>
       <w:r>
@@ -995,7 +992,7 @@
     </w:p>
     <w:p>
       <w:pPr>
-        <w:spacing w:after="180"/>
+        <w:spacing w:after="140"/>
         <w:jc w:val="center"/>
       </w:pPr>
       <w:r>
@@ -1011,7 +1008,7 @@
     <w:p>
       <w:pPr>
         <w:keepNext/>
-        <w:spacing w:before="280" w:after="80"/>
+        <w:spacing w:before="220" w:after="60"/>
       </w:pPr>
       <w:r>
         <w:rPr>
@@ -1136,7 +1133,7 @@
     <w:p>
       <w:pPr>
         <w:keepNext/>
-        <w:spacing w:before="360" w:after="120"/>
+        <w:spacing w:before="400" w:after="120"/>
       </w:pPr>
       <w:r>
         <w:rPr>
@@ -1150,7 +1147,7 @@
     </w:p>
     <w:p>
       <w:pPr>
-        <w:spacing w:after="120"/>
+        <w:spacing w:after="80"/>
       </w:pPr>
       <w:r>
         <w:rPr>
@@ -1175,7 +1172,7 @@
     </w:p>
     <w:p>
       <w:pPr>
-        <w:spacing w:after="120"/>
+        <w:spacing w:after="80"/>
       </w:pPr>
       <w:r>
         <w:rPr>
@@ -1220,7 +1217,7 @@
     </w:p>
     <w:p>
       <w:pPr>
-        <w:spacing w:after="120"/>
+        <w:spacing w:after="80"/>
       </w:pPr>
       <w:r>
         <w:rPr>

</xml_diff>

<commit_message>
Assemble the book: ordered root PDFs, README landing page, front matter
- 12 numbered PDFs at repo root = the finished book in reading order,
  so browsing GitHub shows the table of contents directly
- New front matter: Foreword + Dramatis Personae, and a Lore primer
  (frontmatter/, built by build_foreword.py / build_lore.py)
- book_style: chapter-header rule under every part title (5e-sourcebook feel)
- templates/publish.py rebuilds all sources and renders the ordered PDFs
- README.md: landing page with the clickable ordered volume list
- Retire spent working docs (INVENTORY.md, CONTRADICTIONS.md) to
  _triage/superseded_working_docs; gitignore art_review/ staging
- CLAUDE.md Phase 5 updated to describe the shipping structure

Co-Authored-By: Claude Opus 4.8 <noreply@anthropic.com>
</commit_message>
<xml_diff>
--- a/compendium/treasures_and_relics.docx
+++ b/compendium/treasures_and_relics.docx
@@ -98,6 +98,9 @@
       <w:pPr>
         <w:keepNext/>
         <w:spacing w:before="400" w:after="120"/>
+        <w:pBdr>
+          <w:bottom w:val="single" w:sz="6" w:space="4" w:color="B8860B"/>
+        </w:pBdr>
       </w:pPr>
       <w:r>
         <w:rPr>
@@ -243,6 +246,9 @@
       <w:pPr>
         <w:keepNext/>
         <w:spacing w:before="400" w:after="120"/>
+        <w:pBdr>
+          <w:bottom w:val="single" w:sz="6" w:space="4" w:color="B8860B"/>
+        </w:pBdr>
       </w:pPr>
       <w:r>
         <w:rPr>
@@ -718,6 +724,9 @@
       <w:pPr>
         <w:keepNext/>
         <w:spacing w:before="400" w:after="120"/>
+        <w:pBdr>
+          <w:bottom w:val="single" w:sz="6" w:space="4" w:color="B8860B"/>
+        </w:pBdr>
       </w:pPr>
       <w:r>
         <w:rPr>
@@ -1134,6 +1143,9 @@
       <w:pPr>
         <w:keepNext/>
         <w:spacing w:before="400" w:after="120"/>
+        <w:pBdr>
+          <w:bottom w:val="single" w:sz="6" w:space="4" w:color="B8860B"/>
+        </w:pBdr>
       </w:pPr>
       <w:r>
         <w:rPr>

</xml_diff>